<commit_message>
Specs : gestion d'abonnement, annulation/rétention, dunning, relance provisioning (Word + PDF)
</commit_message>
<xml_diff>
--- a/deliverables/Konsilys_Specifications_Techniques_Fonctionnelles.docx
+++ b/deliverables/Konsilys_Specifications_Techniques_Fonctionnelles.docx
@@ -1663,7 +1663,7 @@
                 <w:b w:val="0"/>
                 <w:sz w:val="19"/>
               </w:rPr>
-              <w:t>id, name, active, has_business_module, has_recrutement_module, devise, exercice fiscal</w:t>
+              <w:t>id, name, active, canceled_at, has_business_module, has_recrutement_module, devise</w:t>
             </w:r>
           </w:p>
         </w:tc>
@@ -2241,7 +2241,7 @@
           <w:i w:val="0"/>
           <w:sz w:val="21"/>
         </w:rPr>
-        <w:t>Chaque membre acheté est provisionné automatiquement : un compte est créé et un e-mail d'invitation lui permet de définir son mot de passe. Une fiche d'équipe (consultants) est créée et rattachée à son responsable (N+1). L'acheteur d'un siège devient le N+1 de la personne provisionnée.</w:t>
+        <w:t>Chaque membre acheté est provisionné automatiquement : un compte est créé et un e-mail d'invitation lui permet de définir son mot de passe. Une fiche d'équipe (consultants) est créée et rattachée à son responsable (N+1). L'acheteur d'un siège devient le N+1 de la personne provisionnée. En cas d'échec (par exemple un e-mail déjà rattaché à un compte), le siège est marqué en erreur et l'administrateur peut relancer le provisioning depuis l'application (fonction retry-seats).</w:t>
       </w:r>
     </w:p>
     <w:p>
@@ -3062,6 +3062,32 @@
     </w:p>
     <w:p>
       <w:pPr>
+        <w:pStyle w:val="ListBullet"/>
+        <w:spacing w:after="60"/>
+      </w:pPr>
+      <w:r>
+        <w:rPr>
+          <w:rFonts w:ascii="Calibri" w:hAnsi="Calibri"/>
+          <w:sz w:val="21"/>
+        </w:rPr>
+        <w:t>Carte « Mon abonnement » (administrateurs) : statut, prochaine échéance (ou date de fin d'accès si annulé), nombre de licences, et accès au portail de gestion de l'abonnement.</w:t>
+      </w:r>
+    </w:p>
+    <w:p>
+      <w:pPr>
+        <w:pStyle w:val="ListBullet"/>
+        <w:spacing w:after="60"/>
+      </w:pPr>
+      <w:r>
+        <w:rPr>
+          <w:rFonts w:ascii="Calibri" w:hAnsi="Calibri"/>
+          <w:sz w:val="21"/>
+        </w:rPr>
+        <w:t>Suivi des sièges achetés (en attente / provisionnés / en erreur) avec relance manuelle du provisioning en cas d'erreur.</w:t>
+      </w:r>
+    </w:p>
+    <w:p>
+      <w:pPr>
         <w:keepNext/>
         <w:spacing w:before="220" w:after="80"/>
       </w:pPr>
@@ -3398,7 +3424,7 @@
           <w:color w:val="1B2B3A"/>
           <w:sz w:val="26"/>
         </w:rPr>
-        <w:t>8.3 Cycle de vie de l'abonnement</w:t>
+        <w:t>8.3 Cycle de vie de l'abonnement et relances de paiement</w:t>
       </w:r>
     </w:p>
     <w:p>
@@ -3412,7 +3438,103 @@
           <w:i w:val="0"/>
           <w:sz w:val="21"/>
         </w:rPr>
-        <w:t>Un abonnement porte les lignes achetées (licences et modules). L'activation de l'entreprise et des modules découle de l'existence d'un abonnement au statut payé (active, trialing ou past_due). Les données ne sont jamais désactivées automatiquement en cas d'incident de paiement isolé, afin d'éviter toute rupture de service intempestive.</w:t>
+        <w:t>Un abonnement porte les lignes achetées (licences et modules). L'activation de l'entreprise et des modules découle de l'existence d'un abonnement au statut payé (active, trialing ou past_due). En cas d'échec d'un paiement récurrent, l'abonnement passe en past_due et une procédure de relance automatique (dunning) tente à nouveau le prélèvement selon un calendrier configuré (par exemple des tentatives hebdomadaires), accompagnée d'e-mails de relance au client. Pendant cette période de relance, l'accès est maintenu.</w:t>
+      </w:r>
+    </w:p>
+    <w:p>
+      <w:pPr>
+        <w:spacing w:after="120"/>
+      </w:pPr>
+      <w:r>
+        <w:rPr>
+          <w:rFonts w:ascii="Calibri" w:hAnsi="Calibri"/>
+          <w:b w:val="0"/>
+          <w:i w:val="0"/>
+          <w:sz w:val="21"/>
+        </w:rPr>
+        <w:t>Si toutes les tentatives échouent, l'abonnement est annulé : l'entreprise est alors désactivée (accès bloqué) mais ses données sont conservées pendant un an (horodatage canceled_at) avant purge éventuelle. Une nouvelle souscription réactive immédiatement l'accès.</w:t>
+      </w:r>
+    </w:p>
+    <w:p>
+      <w:pPr>
+        <w:keepNext/>
+        <w:spacing w:before="220" w:after="80"/>
+      </w:pPr>
+      <w:r>
+        <w:rPr>
+          <w:rFonts w:ascii="Calibri" w:hAnsi="Calibri"/>
+          <w:b/>
+          <w:color w:val="1B2B3A"/>
+          <w:sz w:val="26"/>
+        </w:rPr>
+        <w:t>8.4 Gestion de l'abonnement (self-service)</w:t>
+      </w:r>
+    </w:p>
+    <w:p>
+      <w:pPr>
+        <w:spacing w:after="120"/>
+      </w:pPr>
+      <w:r>
+        <w:rPr>
+          <w:rFonts w:ascii="Calibri" w:hAnsi="Calibri"/>
+          <w:b w:val="0"/>
+          <w:i w:val="0"/>
+          <w:sz w:val="21"/>
+        </w:rPr>
+        <w:t>Les administrateurs disposent, dans l'application, d'une gestion complète de leur abonnement :</w:t>
+      </w:r>
+    </w:p>
+    <w:p>
+      <w:pPr>
+        <w:pStyle w:val="ListBullet"/>
+        <w:spacing w:after="60"/>
+      </w:pPr>
+      <w:r>
+        <w:rPr>
+          <w:rFonts w:ascii="Calibri" w:hAnsi="Calibri"/>
+          <w:sz w:val="21"/>
+        </w:rPr>
+        <w:t>Consultation du statut et de la prochaine échéance directement dans l'interface.</w:t>
+      </w:r>
+    </w:p>
+    <w:p>
+      <w:pPr>
+        <w:pStyle w:val="ListBullet"/>
+        <w:spacing w:after="60"/>
+      </w:pPr>
+      <w:r>
+        <w:rPr>
+          <w:rFonts w:ascii="Calibri" w:hAnsi="Calibri"/>
+          <w:sz w:val="21"/>
+        </w:rPr>
+        <w:t>Accès au portail de facturation sécurisé (Stripe Customer Portal) pour résilier (effet en fin de période payée), réactiver, mettre à jour le moyen de paiement et télécharger les factures.</w:t>
+      </w:r>
+    </w:p>
+    <w:p>
+      <w:pPr>
+        <w:pStyle w:val="ListBullet"/>
+        <w:spacing w:after="60"/>
+      </w:pPr>
+      <w:r>
+        <w:rPr>
+          <w:rFonts w:ascii="Calibri" w:hAnsi="Calibri"/>
+          <w:sz w:val="21"/>
+        </w:rPr>
+        <w:t>Ajout de licences ou de modules à tout moment via le parcours d'achat de sièges.</w:t>
+      </w:r>
+    </w:p>
+    <w:p>
+      <w:pPr>
+        <w:spacing w:after="120"/>
+      </w:pPr>
+      <w:r>
+        <w:rPr>
+          <w:rFonts w:ascii="Calibri" w:hAnsi="Calibri"/>
+          <w:b w:val="0"/>
+          <w:i w:val="0"/>
+          <w:sz w:val="21"/>
+        </w:rPr>
+        <w:t>À la résiliation, l'accès est maintenu jusqu'à la fin de la période déjà réglée, puis l'entreprise est désactivée (données conservées).</w:t>
       </w:r>
     </w:p>
     <w:p>
@@ -3559,6 +3681,19 @@
           <w:rFonts w:ascii="Calibri" w:hAnsi="Calibri"/>
           <w:sz w:val="21"/>
         </w:rPr>
+        <w:t>Blocage automatique de l'accès à l'annulation d'un abonnement, avec conservation des données pendant un an (rétention).</w:t>
+      </w:r>
+    </w:p>
+    <w:p>
+      <w:pPr>
+        <w:pStyle w:val="ListBullet"/>
+        <w:spacing w:after="60"/>
+      </w:pPr>
+      <w:r>
+        <w:rPr>
+          <w:rFonts w:ascii="Calibri" w:hAnsi="Calibri"/>
+          <w:sz w:val="21"/>
+        </w:rPr>
         <w:t>Nettoyage des composants hérités de l'ancien système d'invitations (fonctions et écrans obsolètes) au profit du modèle « compte créé au paiement ».</w:t>
       </w:r>
     </w:p>
@@ -3587,7 +3722,7 @@
           <w:rFonts w:ascii="Calibri" w:hAnsi="Calibri"/>
           <w:sz w:val="21"/>
         </w:rPr>
-        <w:t>Activer la protection contre les mots de passe compromis (vérification HaveIBeenPwned) au niveau de l'authentification.</w:t>
+        <w:t>Protection contre les mots de passe compromis (vérification HaveIBeenPwned) : option disponible avec le plan Pro de la plateforme d'authentification, à activer le moment venu. Une longueur minimale de mot de passe est déjà imposée côté client.</w:t>
       </w:r>
     </w:p>
     <w:p>
@@ -4670,7 +4805,7 @@
           <w:rFonts w:ascii="Calibri" w:hAnsi="Calibri"/>
           <w:sz w:val="21"/>
         </w:rPr>
-        <w:t>Provisioning automatique des sièges avec rattachement N+1 à l'acheteur et création de fiche d'équipe.</w:t>
+        <w:t>Provisioning automatique des sièges avec rattachement N+1 à l'acheteur et création de fiche d'équipe ; relance manuelle possible en cas d'erreur.</w:t>
       </w:r>
     </w:p>
     <w:p>
@@ -4683,7 +4818,33 @@
           <w:rFonts w:ascii="Calibri" w:hAnsi="Calibri"/>
           <w:sz w:val="21"/>
         </w:rPr>
-        <w:t>Nettoyage du site vitrine (doublons retirés, questionnaire recentré sur la démonstration) et passage responsive mobile.</w:t>
+        <w:t>Gestion de l'abonnement dans l'application (statut, échéance, portail de facturation Stripe : résiliation, réactivation, moyen de paiement, factures).</w:t>
+      </w:r>
+    </w:p>
+    <w:p>
+      <w:pPr>
+        <w:pStyle w:val="ListBullet"/>
+        <w:spacing w:after="60"/>
+      </w:pPr>
+      <w:r>
+        <w:rPr>
+          <w:rFonts w:ascii="Calibri" w:hAnsi="Calibri"/>
+          <w:sz w:val="21"/>
+        </w:rPr>
+        <w:t>Annulation d'abonnement : blocage de l'accès et conservation des données pendant un an ; relances de paiement (dunning) configurées côté Stripe.</w:t>
+      </w:r>
+    </w:p>
+    <w:p>
+      <w:pPr>
+        <w:pStyle w:val="ListBullet"/>
+        <w:spacing w:after="60"/>
+      </w:pPr>
+      <w:r>
+        <w:rPr>
+          <w:rFonts w:ascii="Calibri" w:hAnsi="Calibri"/>
+          <w:sz w:val="21"/>
+        </w:rPr>
+        <w:t>Nettoyage du site vitrine (doublons retirés, cartes de prix menant au parcours d'abonnement, navigation par onglets sur mobile, questionnaire recentré sur la démonstration) et passage responsive mobile.</w:t>
       </w:r>
     </w:p>
     <w:p>

</xml_diff>

<commit_message>
Tunnel : choix Admin ou Super Admin à l'inscription (#19)
* Specs : gestion d'abonnement, annulation/rétention, dunning, relance provisioning (Word + PDF)

* Tunnel : choix Admin ou Super Admin pour le compte propriétaire

À l'inscription, l'utilisateur choisit sa propre licence (Admin 39€ ou Super
Admin 49€), au lieu d'Admin imposé. La différence (paramétrage complet +
pilotage 3 niveaux pour Super Admin) est expliquée sur les deux cartes.
Le total, le récapitulatif et le rôle du compte créé (signUp) suivent le choix.
seats-checkout accepte désormais Admin OU Super Admin comme licence propriétaire
à la 1re inscription (OWNER_PRICES).

Co-Authored-By: Claude Opus 4.8 <noreply@anthropic.com>
Claude-Session: https://claude.ai/code/session_01USvXvdfgNeVsVaFCtcwkou

---------

Co-authored-by: Claude <noreply@anthropic.com>
</commit_message>
<xml_diff>
--- a/deliverables/Konsilys_Specifications_Techniques_Fonctionnelles.docx
+++ b/deliverables/Konsilys_Specifications_Techniques_Fonctionnelles.docx
@@ -1663,7 +1663,7 @@
                 <w:b w:val="0"/>
                 <w:sz w:val="19"/>
               </w:rPr>
-              <w:t>id, name, active, has_business_module, has_recrutement_module, devise, exercice fiscal</w:t>
+              <w:t>id, name, active, canceled_at, has_business_module, has_recrutement_module, devise</w:t>
             </w:r>
           </w:p>
         </w:tc>
@@ -2241,7 +2241,7 @@
           <w:i w:val="0"/>
           <w:sz w:val="21"/>
         </w:rPr>
-        <w:t>Chaque membre acheté est provisionné automatiquement : un compte est créé et un e-mail d'invitation lui permet de définir son mot de passe. Une fiche d'équipe (consultants) est créée et rattachée à son responsable (N+1). L'acheteur d'un siège devient le N+1 de la personne provisionnée.</w:t>
+        <w:t>Chaque membre acheté est provisionné automatiquement : un compte est créé et un e-mail d'invitation lui permet de définir son mot de passe. Une fiche d'équipe (consultants) est créée et rattachée à son responsable (N+1). L'acheteur d'un siège devient le N+1 de la personne provisionnée. En cas d'échec (par exemple un e-mail déjà rattaché à un compte), le siège est marqué en erreur et l'administrateur peut relancer le provisioning depuis l'application (fonction retry-seats).</w:t>
       </w:r>
     </w:p>
     <w:p>
@@ -3062,6 +3062,32 @@
     </w:p>
     <w:p>
       <w:pPr>
+        <w:pStyle w:val="ListBullet"/>
+        <w:spacing w:after="60"/>
+      </w:pPr>
+      <w:r>
+        <w:rPr>
+          <w:rFonts w:ascii="Calibri" w:hAnsi="Calibri"/>
+          <w:sz w:val="21"/>
+        </w:rPr>
+        <w:t>Carte « Mon abonnement » (administrateurs) : statut, prochaine échéance (ou date de fin d'accès si annulé), nombre de licences, et accès au portail de gestion de l'abonnement.</w:t>
+      </w:r>
+    </w:p>
+    <w:p>
+      <w:pPr>
+        <w:pStyle w:val="ListBullet"/>
+        <w:spacing w:after="60"/>
+      </w:pPr>
+      <w:r>
+        <w:rPr>
+          <w:rFonts w:ascii="Calibri" w:hAnsi="Calibri"/>
+          <w:sz w:val="21"/>
+        </w:rPr>
+        <w:t>Suivi des sièges achetés (en attente / provisionnés / en erreur) avec relance manuelle du provisioning en cas d'erreur.</w:t>
+      </w:r>
+    </w:p>
+    <w:p>
+      <w:pPr>
         <w:keepNext/>
         <w:spacing w:before="220" w:after="80"/>
       </w:pPr>
@@ -3398,7 +3424,7 @@
           <w:color w:val="1B2B3A"/>
           <w:sz w:val="26"/>
         </w:rPr>
-        <w:t>8.3 Cycle de vie de l'abonnement</w:t>
+        <w:t>8.3 Cycle de vie de l'abonnement et relances de paiement</w:t>
       </w:r>
     </w:p>
     <w:p>
@@ -3412,7 +3438,103 @@
           <w:i w:val="0"/>
           <w:sz w:val="21"/>
         </w:rPr>
-        <w:t>Un abonnement porte les lignes achetées (licences et modules). L'activation de l'entreprise et des modules découle de l'existence d'un abonnement au statut payé (active, trialing ou past_due). Les données ne sont jamais désactivées automatiquement en cas d'incident de paiement isolé, afin d'éviter toute rupture de service intempestive.</w:t>
+        <w:t>Un abonnement porte les lignes achetées (licences et modules). L'activation de l'entreprise et des modules découle de l'existence d'un abonnement au statut payé (active, trialing ou past_due). En cas d'échec d'un paiement récurrent, l'abonnement passe en past_due et une procédure de relance automatique (dunning) tente à nouveau le prélèvement selon un calendrier configuré (par exemple des tentatives hebdomadaires), accompagnée d'e-mails de relance au client. Pendant cette période de relance, l'accès est maintenu.</w:t>
+      </w:r>
+    </w:p>
+    <w:p>
+      <w:pPr>
+        <w:spacing w:after="120"/>
+      </w:pPr>
+      <w:r>
+        <w:rPr>
+          <w:rFonts w:ascii="Calibri" w:hAnsi="Calibri"/>
+          <w:b w:val="0"/>
+          <w:i w:val="0"/>
+          <w:sz w:val="21"/>
+        </w:rPr>
+        <w:t>Si toutes les tentatives échouent, l'abonnement est annulé : l'entreprise est alors désactivée (accès bloqué) mais ses données sont conservées pendant un an (horodatage canceled_at) avant purge éventuelle. Une nouvelle souscription réactive immédiatement l'accès.</w:t>
+      </w:r>
+    </w:p>
+    <w:p>
+      <w:pPr>
+        <w:keepNext/>
+        <w:spacing w:before="220" w:after="80"/>
+      </w:pPr>
+      <w:r>
+        <w:rPr>
+          <w:rFonts w:ascii="Calibri" w:hAnsi="Calibri"/>
+          <w:b/>
+          <w:color w:val="1B2B3A"/>
+          <w:sz w:val="26"/>
+        </w:rPr>
+        <w:t>8.4 Gestion de l'abonnement (self-service)</w:t>
+      </w:r>
+    </w:p>
+    <w:p>
+      <w:pPr>
+        <w:spacing w:after="120"/>
+      </w:pPr>
+      <w:r>
+        <w:rPr>
+          <w:rFonts w:ascii="Calibri" w:hAnsi="Calibri"/>
+          <w:b w:val="0"/>
+          <w:i w:val="0"/>
+          <w:sz w:val="21"/>
+        </w:rPr>
+        <w:t>Les administrateurs disposent, dans l'application, d'une gestion complète de leur abonnement :</w:t>
+      </w:r>
+    </w:p>
+    <w:p>
+      <w:pPr>
+        <w:pStyle w:val="ListBullet"/>
+        <w:spacing w:after="60"/>
+      </w:pPr>
+      <w:r>
+        <w:rPr>
+          <w:rFonts w:ascii="Calibri" w:hAnsi="Calibri"/>
+          <w:sz w:val="21"/>
+        </w:rPr>
+        <w:t>Consultation du statut et de la prochaine échéance directement dans l'interface.</w:t>
+      </w:r>
+    </w:p>
+    <w:p>
+      <w:pPr>
+        <w:pStyle w:val="ListBullet"/>
+        <w:spacing w:after="60"/>
+      </w:pPr>
+      <w:r>
+        <w:rPr>
+          <w:rFonts w:ascii="Calibri" w:hAnsi="Calibri"/>
+          <w:sz w:val="21"/>
+        </w:rPr>
+        <w:t>Accès au portail de facturation sécurisé (Stripe Customer Portal) pour résilier (effet en fin de période payée), réactiver, mettre à jour le moyen de paiement et télécharger les factures.</w:t>
+      </w:r>
+    </w:p>
+    <w:p>
+      <w:pPr>
+        <w:pStyle w:val="ListBullet"/>
+        <w:spacing w:after="60"/>
+      </w:pPr>
+      <w:r>
+        <w:rPr>
+          <w:rFonts w:ascii="Calibri" w:hAnsi="Calibri"/>
+          <w:sz w:val="21"/>
+        </w:rPr>
+        <w:t>Ajout de licences ou de modules à tout moment via le parcours d'achat de sièges.</w:t>
+      </w:r>
+    </w:p>
+    <w:p>
+      <w:pPr>
+        <w:spacing w:after="120"/>
+      </w:pPr>
+      <w:r>
+        <w:rPr>
+          <w:rFonts w:ascii="Calibri" w:hAnsi="Calibri"/>
+          <w:b w:val="0"/>
+          <w:i w:val="0"/>
+          <w:sz w:val="21"/>
+        </w:rPr>
+        <w:t>À la résiliation, l'accès est maintenu jusqu'à la fin de la période déjà réglée, puis l'entreprise est désactivée (données conservées).</w:t>
       </w:r>
     </w:p>
     <w:p>
@@ -3559,6 +3681,19 @@
           <w:rFonts w:ascii="Calibri" w:hAnsi="Calibri"/>
           <w:sz w:val="21"/>
         </w:rPr>
+        <w:t>Blocage automatique de l'accès à l'annulation d'un abonnement, avec conservation des données pendant un an (rétention).</w:t>
+      </w:r>
+    </w:p>
+    <w:p>
+      <w:pPr>
+        <w:pStyle w:val="ListBullet"/>
+        <w:spacing w:after="60"/>
+      </w:pPr>
+      <w:r>
+        <w:rPr>
+          <w:rFonts w:ascii="Calibri" w:hAnsi="Calibri"/>
+          <w:sz w:val="21"/>
+        </w:rPr>
         <w:t>Nettoyage des composants hérités de l'ancien système d'invitations (fonctions et écrans obsolètes) au profit du modèle « compte créé au paiement ».</w:t>
       </w:r>
     </w:p>
@@ -3587,7 +3722,7 @@
           <w:rFonts w:ascii="Calibri" w:hAnsi="Calibri"/>
           <w:sz w:val="21"/>
         </w:rPr>
-        <w:t>Activer la protection contre les mots de passe compromis (vérification HaveIBeenPwned) au niveau de l'authentification.</w:t>
+        <w:t>Protection contre les mots de passe compromis (vérification HaveIBeenPwned) : option disponible avec le plan Pro de la plateforme d'authentification, à activer le moment venu. Une longueur minimale de mot de passe est déjà imposée côté client.</w:t>
       </w:r>
     </w:p>
     <w:p>
@@ -4670,7 +4805,7 @@
           <w:rFonts w:ascii="Calibri" w:hAnsi="Calibri"/>
           <w:sz w:val="21"/>
         </w:rPr>
-        <w:t>Provisioning automatique des sièges avec rattachement N+1 à l'acheteur et création de fiche d'équipe.</w:t>
+        <w:t>Provisioning automatique des sièges avec rattachement N+1 à l'acheteur et création de fiche d'équipe ; relance manuelle possible en cas d'erreur.</w:t>
       </w:r>
     </w:p>
     <w:p>
@@ -4683,7 +4818,33 @@
           <w:rFonts w:ascii="Calibri" w:hAnsi="Calibri"/>
           <w:sz w:val="21"/>
         </w:rPr>
-        <w:t>Nettoyage du site vitrine (doublons retirés, questionnaire recentré sur la démonstration) et passage responsive mobile.</w:t>
+        <w:t>Gestion de l'abonnement dans l'application (statut, échéance, portail de facturation Stripe : résiliation, réactivation, moyen de paiement, factures).</w:t>
+      </w:r>
+    </w:p>
+    <w:p>
+      <w:pPr>
+        <w:pStyle w:val="ListBullet"/>
+        <w:spacing w:after="60"/>
+      </w:pPr>
+      <w:r>
+        <w:rPr>
+          <w:rFonts w:ascii="Calibri" w:hAnsi="Calibri"/>
+          <w:sz w:val="21"/>
+        </w:rPr>
+        <w:t>Annulation d'abonnement : blocage de l'accès et conservation des données pendant un an ; relances de paiement (dunning) configurées côté Stripe.</w:t>
+      </w:r>
+    </w:p>
+    <w:p>
+      <w:pPr>
+        <w:pStyle w:val="ListBullet"/>
+        <w:spacing w:after="60"/>
+      </w:pPr>
+      <w:r>
+        <w:rPr>
+          <w:rFonts w:ascii="Calibri" w:hAnsi="Calibri"/>
+          <w:sz w:val="21"/>
+        </w:rPr>
+        <w:t>Nettoyage du site vitrine (doublons retirés, cartes de prix menant au parcours d'abonnement, navigation par onglets sur mobile, questionnaire recentré sur la démonstration) et passage responsive mobile.</w:t>
       </w:r>
     </w:p>
     <w:p>

</xml_diff>

<commit_message>
Livrables : présentations (prospection, investisseur) + specs mis à jour
- Prospection & Investisseur : nouvelle slide « Grands comptes / groupes
  multi-BU » (prévisionnel 12 mois, marge consolidée BU/Practice, hiérarchie
  6 niveaux, recrutement intelligent + localisation/mobilité, sécurité RGPD
  auditée, robustesse). PPTX + PDF régénérés.
- Spécifications : nouvelle section 13 « Évolutions récentes » (durcissement
  sécurité/RGPD + audit log, pilotage/prévisionnel, multi-BU, recrutement
  pipeline partagé + matching + localisation classifiée + mobilité régionale,
  qualité/tests). DOCX + PDF régénérés.

Co-Authored-By: Claude Opus 4.8 <noreply@anthropic.com>
Claude-Session: https://claude.ai/code/session_01USvXvdfgNeVsVaFCtcwkou
</commit_message>
<xml_diff>
--- a/deliverables/Konsilys_Specifications_Techniques_Fonctionnelles.docx
+++ b/deliverables/Konsilys_Specifications_Techniques_Fonctionnelles.docx
@@ -4860,6 +4860,234 @@
         <w:t>Durcissement de la sécurité de la table des approbations (cloisonnement par entreprise).</w:t>
       </w:r>
     </w:p>
+    <w:p>
+      <w:pPr>
+        <w:keepNext/>
+        <w:spacing w:before="320" w:after="160"/>
+        <w:pBdr>
+          <w:bottom w:val="single" w:sz="6" w:space="4" w:color="84CC16"/>
+        </w:pBdr>
+      </w:pPr>
+      <w:r>
+        <w:rPr>
+          <w:rFonts w:ascii="Calibri" w:hAnsi="Calibri"/>
+          <w:b/>
+          <w:color w:val="1B2B3A"/>
+          <w:sz w:val="34"/>
+        </w:rPr>
+        <w:t>13. Evolutions recentes (securite, pilotage, multi-BU, mobilite)</w:t>
+      </w:r>
+    </w:p>
+    <w:p>
+      <w:pPr>
+        <w:keepNext/>
+        <w:spacing w:before="220" w:after="80"/>
+      </w:pPr>
+      <w:r>
+        <w:rPr>
+          <w:rFonts w:ascii="Calibri" w:hAnsi="Calibri"/>
+          <w:b/>
+          <w:color w:val="1B2B3A"/>
+          <w:sz w:val="26"/>
+        </w:rPr>
+        <w:t>13.1 Durcissement securite et conformite RGPD</w:t>
+      </w:r>
+    </w:p>
+    <w:p>
+      <w:pPr>
+        <w:spacing w:after="120"/>
+      </w:pPr>
+      <w:r>
+        <w:rPr>
+          <w:rFonts w:ascii="Calibri" w:hAnsi="Calibri"/>
+          <w:b w:val="0"/>
+          <w:i w:val="0"/>
+          <w:sz w:val="21"/>
+        </w:rPr>
+        <w:t>Audit RLS systematique des tables : correction d’une elevation de privileges possible via la mise a jour de son propre profil (verrouillage du role et du company_id), restriction des insertions de profil a sa propre ligne, suppression de policies anonymes trop permissives, et fixation du search_path des fonctions SECURITY DEFINER.</w:t>
+      </w:r>
+    </w:p>
+    <w:p>
+      <w:pPr>
+        <w:pStyle w:val="ListBullet"/>
+        <w:spacing w:after="60"/>
+      </w:pPr>
+      <w:r>
+        <w:rPr>
+          <w:rFonts w:ascii="Calibri" w:hAnsi="Calibri"/>
+          <w:sz w:val="21"/>
+        </w:rPr>
+        <w:t>Journal d’activite (audit log) : des declencheurs base de donnees enregistrent toute creation, modification et suppression sur les tables sensibles (consultants, missions, absences, candidats, CRM, profils, parametres), avec acteur, entite et champs modifies. Consultable dans Gestion des acces, cloisonne par entreprise.</w:t>
+      </w:r>
+    </w:p>
+    <w:p>
+      <w:pPr>
+        <w:pStyle w:val="ListBullet"/>
+        <w:spacing w:after="60"/>
+      </w:pPr>
+      <w:r>
+        <w:rPr>
+          <w:rFonts w:ascii="Calibri" w:hAnsi="Calibri"/>
+          <w:sz w:val="21"/>
+        </w:rPr>
+        <w:t>Permissions fines sur les fiches consultants : le rattachement d’equipe (N+1) est reserve au grade gestionnaire et au-dessus ; la Business Unit d’un consultant n’est modifiable que par son N+1 (ou un administrateur). Regles appliquees cote interface et cote serveur.</w:t>
+      </w:r>
+    </w:p>
+    <w:p>
+      <w:pPr>
+        <w:keepNext/>
+        <w:spacing w:before="220" w:after="80"/>
+      </w:pPr>
+      <w:r>
+        <w:rPr>
+          <w:rFonts w:ascii="Calibri" w:hAnsi="Calibri"/>
+          <w:b/>
+          <w:color w:val="1B2B3A"/>
+          <w:sz w:val="26"/>
+        </w:rPr>
+        <w:t>13.2 Pilotage financier : previsionnel et marge consolidee</w:t>
+      </w:r>
+    </w:p>
+    <w:p>
+      <w:pPr>
+        <w:spacing w:after="120"/>
+      </w:pPr>
+      <w:r>
+        <w:rPr>
+          <w:rFonts w:ascii="Calibri" w:hAnsi="Calibri"/>
+          <w:b w:val="0"/>
+          <w:i w:val="0"/>
+          <w:sz w:val="21"/>
+        </w:rPr>
+        <w:t>Un previsionnel de chiffre d’affaires sur douze mois glissants combine le backlog des missions (jours travailles projetes mois par mois) et le pipeline pondere des opportunites (valeur x probabilite, etalee sur la duree). La marge est consolidee par Business Unit et par practice.</w:t>
+      </w:r>
+    </w:p>
+    <w:p>
+      <w:pPr>
+        <w:keepNext/>
+        <w:spacing w:before="220" w:after="80"/>
+      </w:pPr>
+      <w:r>
+        <w:rPr>
+          <w:rFonts w:ascii="Calibri" w:hAnsi="Calibri"/>
+          <w:b/>
+          <w:color w:val="1B2B3A"/>
+          <w:sz w:val="26"/>
+        </w:rPr>
+        <w:t>13.3 Hierarchie multi-Business Units</w:t>
+      </w:r>
+    </w:p>
+    <w:p>
+      <w:pPr>
+        <w:spacing w:after="120"/>
+      </w:pPr>
+      <w:r>
+        <w:rPr>
+          <w:rFonts w:ascii="Calibri" w:hAnsi="Calibri"/>
+          <w:b w:val="0"/>
+          <w:i w:val="0"/>
+          <w:sz w:val="21"/>
+        </w:rPr>
+        <w:t>Une hierarchie de Business Units jusqu’a six niveaux (par exemple Monde, Europe, France, region, agence, equipe) est configurable par le super administrateur. Chaque membre porte une BU, heritee automatiquement de la personne qui a cree son compte. Sert de base a la consolidation de la marge.</w:t>
+      </w:r>
+    </w:p>
+    <w:p>
+      <w:pPr>
+        <w:keepNext/>
+        <w:spacing w:before="220" w:after="80"/>
+      </w:pPr>
+      <w:r>
+        <w:rPr>
+          <w:rFonts w:ascii="Calibri" w:hAnsi="Calibri"/>
+          <w:b/>
+          <w:color w:val="1B2B3A"/>
+          <w:sz w:val="26"/>
+        </w:rPr>
+        <w:t>13.4 Recrutement : pipeline partage et matching</w:t>
+      </w:r>
+    </w:p>
+    <w:p>
+      <w:pPr>
+        <w:spacing w:after="120"/>
+      </w:pPr>
+      <w:r>
+        <w:rPr>
+          <w:rFonts w:ascii="Calibri" w:hAnsi="Calibri"/>
+          <w:b w:val="0"/>
+          <w:i w:val="0"/>
+          <w:sz w:val="21"/>
+        </w:rPr>
+        <w:t>Le vivier de candidats est partage a l’echelle de l’entreprise (visible par tous les roles disposant du module), avec filtres Mes candidats, statut, recruteur, localisation et expertise. Un candidat recrute cree une fiche consultant reliee a son gestionnaire et heritant de sa BU.</w:t>
+      </w:r>
+    </w:p>
+    <w:p>
+      <w:pPr>
+        <w:pStyle w:val="ListBullet"/>
+        <w:spacing w:after="60"/>
+      </w:pPr>
+      <w:r>
+        <w:rPr>
+          <w:rFonts w:ascii="Calibri" w:hAnsi="Calibri"/>
+          <w:sz w:val="21"/>
+        </w:rPr>
+        <w:t>Matching opportunite -&gt; candidats : les criteres expertise, localisation, annees d’experience et secteur sont combines ; les candidats sont classes par nombre de criteres satisfaits.</w:t>
+      </w:r>
+    </w:p>
+    <w:p>
+      <w:pPr>
+        <w:pStyle w:val="ListBullet"/>
+        <w:spacing w:after="60"/>
+      </w:pPr>
+      <w:r>
+        <w:rPr>
+          <w:rFonts w:ascii="Calibri" w:hAnsi="Calibri"/>
+          <w:sz w:val="21"/>
+        </w:rPr>
+        <w:t>Localisation candidat classifiee : localisation cible (priorite), localisations secondaires (pret a aller) et option mobilite France entiere, avec recherche parmi les grandes villes de France. La priorite est prise en compte dans le classement des suggestions.</w:t>
+      </w:r>
+    </w:p>
+    <w:p>
+      <w:pPr>
+        <w:pStyle w:val="ListBullet"/>
+        <w:spacing w:after="60"/>
+      </w:pPr>
+      <w:r>
+        <w:rPr>
+          <w:rFonts w:ascii="Calibri" w:hAnsi="Calibri"/>
+          <w:sz w:val="21"/>
+        </w:rPr>
+        <w:t>Mobilite regionale des consultants : region de rattachement et villes de mobilite, choisies parmi les villes de la region definies par le super administrateur dans les Parametres.</w:t>
+      </w:r>
+    </w:p>
+    <w:p>
+      <w:pPr>
+        <w:keepNext/>
+        <w:spacing w:before="220" w:after="80"/>
+      </w:pPr>
+      <w:r>
+        <w:rPr>
+          <w:rFonts w:ascii="Calibri" w:hAnsi="Calibri"/>
+          <w:b/>
+          <w:color w:val="1B2B3A"/>
+          <w:sz w:val="26"/>
+        </w:rPr>
+        <w:t>13.5 Qualite et robustesse du code</w:t>
+      </w:r>
+    </w:p>
+    <w:p>
+      <w:pPr>
+        <w:spacing w:after="120"/>
+      </w:pPr>
+      <w:r>
+        <w:rPr>
+          <w:rFonts w:ascii="Calibri" w:hAnsi="Calibri"/>
+          <w:b w:val="0"/>
+          <w:i w:val="0"/>
+          <w:sz w:val="21"/>
+        </w:rPr>
+        <w:t>Le code de l’application produit a ete decoupe en modules charges dans l’ordre (sans etape de build), et une suite de tests de bout-en-bout (Playwright, hors-ligne) verifie les parcours critiques a chaque evolution afin de prevenir les regressions.</w:t>
+      </w:r>
+    </w:p>
     <w:sectPr>
       <w:footerReference w:type="default" r:id="rId9"/>
       <w:pgSz w:w="12240" w:h="15840"/>

</xml_diff>

<commit_message>
Livrables : présentations + spécifications mises à jour (#36)
- Prospection & Investisseur : nouvelle slide « Grands comptes / groupes
  multi-BU » (prévisionnel 12 mois, marge consolidée BU/Practice, hiérarchie
  6 niveaux, recrutement intelligent + localisation/mobilité, sécurité RGPD
  auditée, robustesse). PPTX + PDF régénérés.
- Spécifications : nouvelle section 13 « Évolutions récentes » (durcissement
  sécurité/RGPD + audit log, pilotage/prévisionnel, multi-BU, recrutement
  pipeline partagé + matching + localisation classifiée + mobilité régionale,
  qualité/tests). DOCX + PDF régénérés.


Claude-Session: https://claude.ai/code/session_01USvXvdfgNeVsVaFCtcwkou

Co-authored-by: Claude <noreply@anthropic.com>
</commit_message>
<xml_diff>
--- a/deliverables/Konsilys_Specifications_Techniques_Fonctionnelles.docx
+++ b/deliverables/Konsilys_Specifications_Techniques_Fonctionnelles.docx
@@ -4860,6 +4860,234 @@
         <w:t>Durcissement de la sécurité de la table des approbations (cloisonnement par entreprise).</w:t>
       </w:r>
     </w:p>
+    <w:p>
+      <w:pPr>
+        <w:keepNext/>
+        <w:spacing w:before="320" w:after="160"/>
+        <w:pBdr>
+          <w:bottom w:val="single" w:sz="6" w:space="4" w:color="84CC16"/>
+        </w:pBdr>
+      </w:pPr>
+      <w:r>
+        <w:rPr>
+          <w:rFonts w:ascii="Calibri" w:hAnsi="Calibri"/>
+          <w:b/>
+          <w:color w:val="1B2B3A"/>
+          <w:sz w:val="34"/>
+        </w:rPr>
+        <w:t>13. Evolutions recentes (securite, pilotage, multi-BU, mobilite)</w:t>
+      </w:r>
+    </w:p>
+    <w:p>
+      <w:pPr>
+        <w:keepNext/>
+        <w:spacing w:before="220" w:after="80"/>
+      </w:pPr>
+      <w:r>
+        <w:rPr>
+          <w:rFonts w:ascii="Calibri" w:hAnsi="Calibri"/>
+          <w:b/>
+          <w:color w:val="1B2B3A"/>
+          <w:sz w:val="26"/>
+        </w:rPr>
+        <w:t>13.1 Durcissement securite et conformite RGPD</w:t>
+      </w:r>
+    </w:p>
+    <w:p>
+      <w:pPr>
+        <w:spacing w:after="120"/>
+      </w:pPr>
+      <w:r>
+        <w:rPr>
+          <w:rFonts w:ascii="Calibri" w:hAnsi="Calibri"/>
+          <w:b w:val="0"/>
+          <w:i w:val="0"/>
+          <w:sz w:val="21"/>
+        </w:rPr>
+        <w:t>Audit RLS systematique des tables : correction d’une elevation de privileges possible via la mise a jour de son propre profil (verrouillage du role et du company_id), restriction des insertions de profil a sa propre ligne, suppression de policies anonymes trop permissives, et fixation du search_path des fonctions SECURITY DEFINER.</w:t>
+      </w:r>
+    </w:p>
+    <w:p>
+      <w:pPr>
+        <w:pStyle w:val="ListBullet"/>
+        <w:spacing w:after="60"/>
+      </w:pPr>
+      <w:r>
+        <w:rPr>
+          <w:rFonts w:ascii="Calibri" w:hAnsi="Calibri"/>
+          <w:sz w:val="21"/>
+        </w:rPr>
+        <w:t>Journal d’activite (audit log) : des declencheurs base de donnees enregistrent toute creation, modification et suppression sur les tables sensibles (consultants, missions, absences, candidats, CRM, profils, parametres), avec acteur, entite et champs modifies. Consultable dans Gestion des acces, cloisonne par entreprise.</w:t>
+      </w:r>
+    </w:p>
+    <w:p>
+      <w:pPr>
+        <w:pStyle w:val="ListBullet"/>
+        <w:spacing w:after="60"/>
+      </w:pPr>
+      <w:r>
+        <w:rPr>
+          <w:rFonts w:ascii="Calibri" w:hAnsi="Calibri"/>
+          <w:sz w:val="21"/>
+        </w:rPr>
+        <w:t>Permissions fines sur les fiches consultants : le rattachement d’equipe (N+1) est reserve au grade gestionnaire et au-dessus ; la Business Unit d’un consultant n’est modifiable que par son N+1 (ou un administrateur). Regles appliquees cote interface et cote serveur.</w:t>
+      </w:r>
+    </w:p>
+    <w:p>
+      <w:pPr>
+        <w:keepNext/>
+        <w:spacing w:before="220" w:after="80"/>
+      </w:pPr>
+      <w:r>
+        <w:rPr>
+          <w:rFonts w:ascii="Calibri" w:hAnsi="Calibri"/>
+          <w:b/>
+          <w:color w:val="1B2B3A"/>
+          <w:sz w:val="26"/>
+        </w:rPr>
+        <w:t>13.2 Pilotage financier : previsionnel et marge consolidee</w:t>
+      </w:r>
+    </w:p>
+    <w:p>
+      <w:pPr>
+        <w:spacing w:after="120"/>
+      </w:pPr>
+      <w:r>
+        <w:rPr>
+          <w:rFonts w:ascii="Calibri" w:hAnsi="Calibri"/>
+          <w:b w:val="0"/>
+          <w:i w:val="0"/>
+          <w:sz w:val="21"/>
+        </w:rPr>
+        <w:t>Un previsionnel de chiffre d’affaires sur douze mois glissants combine le backlog des missions (jours travailles projetes mois par mois) et le pipeline pondere des opportunites (valeur x probabilite, etalee sur la duree). La marge est consolidee par Business Unit et par practice.</w:t>
+      </w:r>
+    </w:p>
+    <w:p>
+      <w:pPr>
+        <w:keepNext/>
+        <w:spacing w:before="220" w:after="80"/>
+      </w:pPr>
+      <w:r>
+        <w:rPr>
+          <w:rFonts w:ascii="Calibri" w:hAnsi="Calibri"/>
+          <w:b/>
+          <w:color w:val="1B2B3A"/>
+          <w:sz w:val="26"/>
+        </w:rPr>
+        <w:t>13.3 Hierarchie multi-Business Units</w:t>
+      </w:r>
+    </w:p>
+    <w:p>
+      <w:pPr>
+        <w:spacing w:after="120"/>
+      </w:pPr>
+      <w:r>
+        <w:rPr>
+          <w:rFonts w:ascii="Calibri" w:hAnsi="Calibri"/>
+          <w:b w:val="0"/>
+          <w:i w:val="0"/>
+          <w:sz w:val="21"/>
+        </w:rPr>
+        <w:t>Une hierarchie de Business Units jusqu’a six niveaux (par exemple Monde, Europe, France, region, agence, equipe) est configurable par le super administrateur. Chaque membre porte une BU, heritee automatiquement de la personne qui a cree son compte. Sert de base a la consolidation de la marge.</w:t>
+      </w:r>
+    </w:p>
+    <w:p>
+      <w:pPr>
+        <w:keepNext/>
+        <w:spacing w:before="220" w:after="80"/>
+      </w:pPr>
+      <w:r>
+        <w:rPr>
+          <w:rFonts w:ascii="Calibri" w:hAnsi="Calibri"/>
+          <w:b/>
+          <w:color w:val="1B2B3A"/>
+          <w:sz w:val="26"/>
+        </w:rPr>
+        <w:t>13.4 Recrutement : pipeline partage et matching</w:t>
+      </w:r>
+    </w:p>
+    <w:p>
+      <w:pPr>
+        <w:spacing w:after="120"/>
+      </w:pPr>
+      <w:r>
+        <w:rPr>
+          <w:rFonts w:ascii="Calibri" w:hAnsi="Calibri"/>
+          <w:b w:val="0"/>
+          <w:i w:val="0"/>
+          <w:sz w:val="21"/>
+        </w:rPr>
+        <w:t>Le vivier de candidats est partage a l’echelle de l’entreprise (visible par tous les roles disposant du module), avec filtres Mes candidats, statut, recruteur, localisation et expertise. Un candidat recrute cree une fiche consultant reliee a son gestionnaire et heritant de sa BU.</w:t>
+      </w:r>
+    </w:p>
+    <w:p>
+      <w:pPr>
+        <w:pStyle w:val="ListBullet"/>
+        <w:spacing w:after="60"/>
+      </w:pPr>
+      <w:r>
+        <w:rPr>
+          <w:rFonts w:ascii="Calibri" w:hAnsi="Calibri"/>
+          <w:sz w:val="21"/>
+        </w:rPr>
+        <w:t>Matching opportunite -&gt; candidats : les criteres expertise, localisation, annees d’experience et secteur sont combines ; les candidats sont classes par nombre de criteres satisfaits.</w:t>
+      </w:r>
+    </w:p>
+    <w:p>
+      <w:pPr>
+        <w:pStyle w:val="ListBullet"/>
+        <w:spacing w:after="60"/>
+      </w:pPr>
+      <w:r>
+        <w:rPr>
+          <w:rFonts w:ascii="Calibri" w:hAnsi="Calibri"/>
+          <w:sz w:val="21"/>
+        </w:rPr>
+        <w:t>Localisation candidat classifiee : localisation cible (priorite), localisations secondaires (pret a aller) et option mobilite France entiere, avec recherche parmi les grandes villes de France. La priorite est prise en compte dans le classement des suggestions.</w:t>
+      </w:r>
+    </w:p>
+    <w:p>
+      <w:pPr>
+        <w:pStyle w:val="ListBullet"/>
+        <w:spacing w:after="60"/>
+      </w:pPr>
+      <w:r>
+        <w:rPr>
+          <w:rFonts w:ascii="Calibri" w:hAnsi="Calibri"/>
+          <w:sz w:val="21"/>
+        </w:rPr>
+        <w:t>Mobilite regionale des consultants : region de rattachement et villes de mobilite, choisies parmi les villes de la region definies par le super administrateur dans les Parametres.</w:t>
+      </w:r>
+    </w:p>
+    <w:p>
+      <w:pPr>
+        <w:keepNext/>
+        <w:spacing w:before="220" w:after="80"/>
+      </w:pPr>
+      <w:r>
+        <w:rPr>
+          <w:rFonts w:ascii="Calibri" w:hAnsi="Calibri"/>
+          <w:b/>
+          <w:color w:val="1B2B3A"/>
+          <w:sz w:val="26"/>
+        </w:rPr>
+        <w:t>13.5 Qualite et robustesse du code</w:t>
+      </w:r>
+    </w:p>
+    <w:p>
+      <w:pPr>
+        <w:spacing w:after="120"/>
+      </w:pPr>
+      <w:r>
+        <w:rPr>
+          <w:rFonts w:ascii="Calibri" w:hAnsi="Calibri"/>
+          <w:b w:val="0"/>
+          <w:i w:val="0"/>
+          <w:sz w:val="21"/>
+        </w:rPr>
+        <w:t>Le code de l’application produit a ete decoupe en modules charges dans l’ordre (sans etape de build), et une suite de tests de bout-en-bout (Playwright, hors-ligne) verifie les parcours critiques a chaque evolution afin de prevenir les regressions.</w:t>
+      </w:r>
+    </w:p>
     <w:sectPr>
       <w:footerReference w:type="default" r:id="rId9"/>
       <w:pgSz w:w="12240" w:h="15840"/>

</xml_diff>